<commit_message>
docs: tailor IoT test to Kota Bharu cafe
</commit_message>
<xml_diff>
--- a/current_sem/BCL1123 - Internet of Things/assignment/20260718_SUOL2500321_Smart_Bedroom_IoT_Proposal/20260801_SUOL2500321_BCL1123_IoT_Test_Answered.docx
+++ b/current_sem/BCL1123 - Internet of Things/assignment/20260718_SUOL2500321_Smart_Bedroom_IoT_Proposal/20260801_SUOL2500321_BCL1123_IoT_Test_Answered.docx
@@ -5013,7 +5013,7 @@
                 <w:color w:val="9C0006"/>
                 <w:sz w:val="22"/>
               </w:rPr>
-              <w:t>STUDENT ACTION REQUIRED — Insert a real selfie showing Chan Jing Yi beside the bedroom study desk and its lamp or wall-switch panel. Both the student and selected area must be clearly visible. A room-only photograph receives zero marks.</w:t>
+              <w:t>STUDENT ACTION REQUIRED — Insert a real selfie showing Chan Jing Yi seated or standing in the outdoor café seating area. The student, café table, and preferably the awning or nearby fan must be clearly visible so the selected environment matches the answers below.</w:t>
             </w:r>
           </w:p>
         </w:tc>
@@ -5127,7 +5127,7 @@
           <w:i w:val="0"/>
           <w:sz w:val="22"/>
         </w:rPr>
-        <w:t>The first sensor would be a passive infrared (PIR) occupancy sensor positioned to detect movement around the bedroom study desk. It is appropriate because the main requirement is to distinguish an occupied work area from an empty room without recording identifiable video. Its low data rate and modest power requirement also suit continuous indoor monitoring. A short timeout can reduce false “vacant” decisions when the user is sitting relatively still.</w:t>
+        <w:t>The first sensor would be a digital temperature-and-humidity sensor such as the SHT31, installed in a shaded and ventilated position within the outdoor café seating area. It is appropriate because customer comfort depends on both air temperature and relative humidity; placing it away from direct sunlight and cooking exhaust produces a more representative reading. Unlike a simple thermostat, the combined measurements allow the controller to estimate when the seating area feels hot and humid rather than reacting to temperature alone.</w:t>
       </w:r>
     </w:p>
     <w:p>
@@ -5142,7 +5142,7 @@
           <w:i w:val="0"/>
           <w:sz w:val="22"/>
         </w:rPr>
-        <w:t>The second sensor would be a digital ambient-light sensor such as the BH1750, mounted where it measures desk illumination rather than looking directly into the lamp. It reports light level in lux, allowing the controller to distinguish daylight, adequate artificial light, and an under-lit workspace. This is more precise than a simple light-dependent resistor and permits a configurable comfort threshold for reading or computer work.</w:t>
+        <w:t>The second sensor would be a rain sensor mounted on the exposed edge of the café roof or awning. It is appropriate because an outdoor seating area needs an immediate indication of rainfall before tables, customers, food, or electrical equipment become wet. The sensing surface should be angled so water can drain, and the software should require several consistent readings to reduce false triggers caused by splashes or cleaning water.</w:t>
       </w:r>
     </w:p>
     <w:p>
@@ -5224,7 +5224,7 @@
           <w:i w:val="0"/>
           <w:sz w:val="22"/>
         </w:rPr>
-        <w:t>The controller would combine occupancy and lux rather than acting on either value alone. When the PIR detects a user and desk illumination is below the chosen threshold, it would switch on or dim up the desk lamp through a safe relay or smart-light interface. If daylight is already sufficient, the lamp would remain off. When no movement is detected for a defined period, the system would send a warning and then switch the lamp off; a manual switch must always override the automation.</w:t>
+        <w:t>The controller would compare temperature and humidity with the café’s comfort thresholds. When conditions become hot and humid, it would switch on or increase the speed of the outdoor fan through a safe relay or smart controller. When the rain sensor confirms rainfall, the system would extend a motorised awning, notify café staff, and protect the outdoor tables. The awning should not retract until the sensor has remained dry for a set period, preventing repeated movement during intermittent rain. Manual controls and wind-safety protection must override the automation.</w:t>
       </w:r>
     </w:p>
     <w:p>
@@ -5239,7 +5239,7 @@
           <w:i w:val="0"/>
           <w:sz w:val="22"/>
         </w:rPr>
-        <w:t>The platform would store only time-stamped occupancy state, lux, lamp state, and energy use. These records can reveal how long lights remain on unnecessarily and help tune the threshold and timeout. The user receives appropriate lighting without repeated manual adjustment, reduces wasted electricity when leaving the room, and retains privacy because the design uses motion and light measurements rather than a camera.</w:t>
+        <w:t>The platform would store time-stamped temperature, humidity, rain state, fan speed, and awning position. Café staff could review the data to identify uncomfortable periods, adjust seating arrangements, and maintain the fan or awning before failure. Customers receive a safer and more comfortable outdoor space, while the café avoids running the fan continuously and can respond to rain quickly without relying on a staff member noticing it first.</w:t>
       </w:r>
     </w:p>
     <w:p>
@@ -5381,7 +5381,7 @@
           <w:i w:val="0"/>
           <w:sz w:val="22"/>
         </w:rPr>
-        <w:t>The selected city is Kuala Lumpur, Malaysia. Low-lying roads and drains around the city can become unsafe during intense rainfall when water accumulates faster than the drainage system can carry it. Flash flooding disrupts traffic and may leave drivers entering a flooded road before a warning is displayed.</w:t>
+        <w:t>The selected city is Kota Bharu, Kelantan, Malaysia. Low-lying neighbourhoods, roads, and drains near Sungai Kelantan can become unsafe during intense rainfall and the monsoon when river and drain levels rise. Floodwater disrupts travel and may leave residents or drivers entering an affected area before a warning reaches them. The Department of Irrigation and Drainage already monitors Kota Bharu stations such as Sungai Kelantan at Tambatan D’Raja, so additional local sensor nodes could increase coverage between existing stations.</w:t>
       </w:r>
     </w:p>
     <w:p>
@@ -5396,7 +5396,7 @@
           <w:i w:val="0"/>
           <w:sz w:val="22"/>
         </w:rPr>
-        <w:t>An IoT network could place non-contact ultrasonic water-level sensors above critical drains and road underpasses, supported by tipping-bucket rain gauges at nearby locations. Each node would report water depth, rate of rise, rainfall intensity, battery condition, and location. Combining several nearby readings would give the city control centre earlier and more reliable evidence than a single visual report, allowing targeted warnings, drain inspections, road closures, and pump or siren activation.</w:t>
+        <w:t>An IoT network could place non-contact ultrasonic water-level sensors above critical drains and flood-prone roads, supported by tipping-bucket rain gauges at nearby locations. Each node would report water depth, rate of rise, rainfall intensity, battery condition, and location. Combining several nearby readings would give JPS Kelantan and the local authority earlier and more reliable evidence than a single visual report, allowing targeted warnings, drain inspections, road closures, evacuation preparation, and siren activation.</w:t>
       </w:r>
     </w:p>
     <w:p>
@@ -5495,7 +5495,7 @@
           <w:i w:val="0"/>
           <w:sz w:val="22"/>
         </w:rPr>
-        <w:t>LoRaWAN is the more practical primary link for Kuala Lumpur’s distributed drain and underpass sensors because each node sends only a few bytes, many locations lack convenient mains power, and battery replacement beside drains creates cost and safety problems. Gateways can be mounted at council facilities and forward data through fibre or cellular backhaul. Critical sites should use acknowledged alarms, repeated transmissions, local sirens, and a cellular fallback because no single wireless link should be the only flood-safety control.</w:t>
+        <w:t>LoRaWAN is the more practical primary link for Kota Bharu’s distributed river, drain, and low-lying-road sensors because each node sends only a few bytes, many locations lack convenient mains power, and battery replacement beside waterways creates cost and safety problems. Gateways can be mounted at JPS or local-authority facilities and forward data through fibre or cellular backhaul. Critical sites should use acknowledged alarms, repeated transmissions, local sirens, and a cellular fallback because no single wireless link should be the only flood-safety control.</w:t>
       </w:r>
     </w:p>
     <w:p>
@@ -5643,7 +5643,7 @@
                 <w:color w:val="9C0006"/>
                 <w:sz w:val="22"/>
               </w:rPr>
-              <w:t>STUDENT ACTION REQUIRED — Hand-draw on paper: Water-level sensor + rain gauge (Physical Layer) → LoRaWAN node and gateway (Network Layer) → IoT platform, database, threshold and trend analytics (Middleware Layer) → DBKL/KLCCC dashboard, mobile alert, electronic sign and local siren (Application Layer). Write SUOL2500321 and your signature in one corner, photograph the complete sheet, and replace this box with the image.</w:t>
+              <w:t>STUDENT ACTION REQUIRED — Hand-draw on paper: Water-level sensor + rain gauge near Sungai Kelantan and flood-prone drains (Physical Layer) → LoRaWAN node and gateway (Network Layer) → IoT platform, database, threshold and rising-water analysis (Middleware Layer) → JPS Kelantan/local-authority dashboard, public mobile alert, road warning sign and local siren (Application Layer). Write SUOL2500321 and your signature in one corner, photograph the complete sheet, and replace this box with the image.</w:t>
             </w:r>
           </w:p>
         </w:tc>
@@ -5685,7 +5685,7 @@
           <w:rFonts w:ascii="Arial" w:hAnsi="Arial"/>
           <w:sz w:val="18"/>
         </w:rPr>
-        <w:t>Dewan Bandaraya Kuala Lumpur. (2026). Department of Civil Engineering and Drainage. https://www.dbkl.gov.my/en/departments/jabatan-kejuruteraan-awam-dan-saliran</w:t>
+        <w:t>Department of Irrigation and Drainage Malaysia. (2026). River water-level data: Kelantan. https://publicinfobanjir.water.gov.my/aras-air/data-paras-air/?lang=en&amp;state=KEL</w:t>
       </w:r>
     </w:p>
     <w:p>

</xml_diff>